<commit_message>
fix [quiz - g1]
</commit_message>
<xml_diff>
--- a/1-G-1/9-week-9/5-Quiz/Computer Quiz G1 N1 (Answer).docx
+++ b/1-G-1/9-week-9/5-Quiz/Computer Quiz G1 N1 (Answer).docx
@@ -482,7 +482,261 @@
         <mc:AlternateContent>
           <mc:Choice Requires="wps">
             <w:drawing>
-              <wp:anchor distT="45720" distB="45720" distL="114300" distR="114300" simplePos="0" relativeHeight="251649024" behindDoc="0" locked="0" layoutInCell="1" allowOverlap="1" wp14:anchorId="20D99B0E" wp14:editId="05B8C6C5">
+              <wp:anchor distT="45720" distB="45720" distL="114300" distR="114300" simplePos="0" relativeHeight="251664384" behindDoc="0" locked="0" layoutInCell="1" allowOverlap="1" wp14:anchorId="41B255B2" wp14:editId="36246428">
+                <wp:simplePos x="0" y="0"/>
+                <wp:positionH relativeFrom="column">
+                  <wp:posOffset>205740</wp:posOffset>
+                </wp:positionH>
+                <wp:positionV relativeFrom="paragraph">
+                  <wp:posOffset>2489200</wp:posOffset>
+                </wp:positionV>
+                <wp:extent cx="2360930" cy="1404620"/>
+                <wp:effectExtent l="0" t="0" r="19050" b="17780"/>
+                <wp:wrapSquare wrapText="bothSides"/>
+                <wp:docPr id="511940757" name="Text Box 2"/>
+                <wp:cNvGraphicFramePr>
+                  <a:graphicFrameLocks xmlns:a="http://schemas.openxmlformats.org/drawingml/2006/main"/>
+                </wp:cNvGraphicFramePr>
+                <a:graphic xmlns:a="http://schemas.openxmlformats.org/drawingml/2006/main">
+                  <a:graphicData uri="http://schemas.microsoft.com/office/word/2010/wordprocessingShape">
+                    <wps:wsp>
+                      <wps:cNvSpPr txBox="1">
+                        <a:spLocks noChangeArrowheads="1"/>
+                      </wps:cNvSpPr>
+                      <wps:spPr bwMode="auto">
+                        <a:xfrm>
+                          <a:off x="0" y="0"/>
+                          <a:ext cx="2360930" cy="1404620"/>
+                        </a:xfrm>
+                        <a:prstGeom prst="rect">
+                          <a:avLst/>
+                        </a:prstGeom>
+                        <a:noFill/>
+                        <a:ln w="9525">
+                          <a:solidFill>
+                            <a:srgbClr val="000000"/>
+                          </a:solidFill>
+                          <a:miter lim="800000"/>
+                          <a:headEnd/>
+                          <a:tailEnd/>
+                        </a:ln>
+                      </wps:spPr>
+                      <wps:txbx>
+                        <w:txbxContent>
+                          <w:p>
+                            <w:pPr>
+                              <w:jc w:val="center"/>
+                              <w:rPr>
+                                <w:b/>
+                                <w:bCs/>
+                                <w:sz w:val="56"/>
+                                <w:szCs w:val="56"/>
+                                <w:lang w:bidi="ar-EG"/>
+                              </w:rPr>
+                            </w:pPr>
+                            <w:r>
+                              <w:rPr>
+                                <w:b/>
+                                <w:bCs/>
+                                <w:sz w:val="56"/>
+                                <w:szCs w:val="56"/>
+                                <w:lang w:bidi="ar-EG"/>
+                              </w:rPr>
+                              <w:t>Tablet</w:t>
+                            </w:r>
+                          </w:p>
+                        </w:txbxContent>
+                      </wps:txbx>
+                      <wps:bodyPr rot="0" vert="horz" wrap="square" lIns="91440" tIns="45720" rIns="91440" bIns="45720" anchor="t" anchorCtr="0">
+                        <a:spAutoFit/>
+                      </wps:bodyPr>
+                    </wps:wsp>
+                  </a:graphicData>
+                </a:graphic>
+                <wp14:sizeRelH relativeFrom="margin">
+                  <wp14:pctWidth>40000</wp14:pctWidth>
+                </wp14:sizeRelH>
+                <wp14:sizeRelV relativeFrom="margin">
+                  <wp14:pctHeight>20000</wp14:pctHeight>
+                </wp14:sizeRelV>
+              </wp:anchor>
+            </w:drawing>
+          </mc:Choice>
+          <mc:Fallback>
+            <w:pict>
+              <v:shapetype w14:anchorId="41B255B2" id="_x0000_t202" coordsize="21600,21600" o:spt="202" path="m,l,21600r21600,l21600,xe">
+                <v:stroke joinstyle="miter"/>
+                <v:path gradientshapeok="t" o:connecttype="rect"/>
+              </v:shapetype>
+              <v:shape id="Text Box 2" o:spid="_x0000_s1026" type="#_x0000_t202" style="position:absolute;margin-left:16.2pt;margin-top:196pt;width:185.9pt;height:110.6pt;z-index:251664384;visibility:visible;mso-wrap-style:square;mso-width-percent:400;mso-height-percent:200;mso-wrap-distance-left:9pt;mso-wrap-distance-top:3.6pt;mso-wrap-distance-right:9pt;mso-wrap-distance-bottom:3.6pt;mso-position-horizontal:absolute;mso-position-horizontal-relative:text;mso-position-vertical:absolute;mso-position-vertical-relative:text;mso-width-percent:400;mso-height-percent:200;mso-width-relative:margin;mso-height-relative:margin;v-text-anchor:top" o:gfxdata="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" filled="f">
+                <v:textbox style="mso-fit-shape-to-text:t">
+                  <w:txbxContent>
+                    <w:p>
+                      <w:pPr>
+                        <w:jc w:val="center"/>
+                        <w:rPr>
+                          <w:b/>
+                          <w:bCs/>
+                          <w:sz w:val="56"/>
+                          <w:szCs w:val="56"/>
+                          <w:lang w:bidi="ar-EG"/>
+                        </w:rPr>
+                      </w:pPr>
+                      <w:r>
+                        <w:rPr>
+                          <w:b/>
+                          <w:bCs/>
+                          <w:sz w:val="56"/>
+                          <w:szCs w:val="56"/>
+                          <w:lang w:bidi="ar-EG"/>
+                        </w:rPr>
+                        <w:t>Tablet</w:t>
+                      </w:r>
+                    </w:p>
+                  </w:txbxContent>
+                </v:textbox>
+                <w10:wrap type="square"/>
+              </v:shape>
+            </w:pict>
+          </mc:Fallback>
+        </mc:AlternateContent>
+      </w:r>
+      <w:r>
+        <w:rPr>
+          <w:rFonts w:ascii="Lucida Bright" w:hAnsi="Lucida Bright"/>
+          <w:noProof/>
+          <w:sz w:val="36"/>
+          <w:szCs w:val="36"/>
+        </w:rPr>
+        <mc:AlternateContent>
+          <mc:Choice Requires="wps">
+            <w:drawing>
+              <wp:anchor distT="45720" distB="45720" distL="114300" distR="114300" simplePos="0" relativeHeight="251657216" behindDoc="0" locked="0" layoutInCell="1" allowOverlap="1" wp14:anchorId="5FECBAC5" wp14:editId="258F7BCF">
+                <wp:simplePos x="0" y="0"/>
+                <wp:positionH relativeFrom="column">
+                  <wp:posOffset>205740</wp:posOffset>
+                </wp:positionH>
+                <wp:positionV relativeFrom="paragraph">
+                  <wp:posOffset>4611370</wp:posOffset>
+                </wp:positionV>
+                <wp:extent cx="2360930" cy="1404620"/>
+                <wp:effectExtent l="0" t="0" r="19050" b="17780"/>
+                <wp:wrapSquare wrapText="bothSides"/>
+                <wp:docPr id="2131063583" name="Text Box 2"/>
+                <wp:cNvGraphicFramePr>
+                  <a:graphicFrameLocks xmlns:a="http://schemas.openxmlformats.org/drawingml/2006/main"/>
+                </wp:cNvGraphicFramePr>
+                <a:graphic xmlns:a="http://schemas.openxmlformats.org/drawingml/2006/main">
+                  <a:graphicData uri="http://schemas.microsoft.com/office/word/2010/wordprocessingShape">
+                    <wps:wsp>
+                      <wps:cNvSpPr txBox="1">
+                        <a:spLocks noChangeArrowheads="1"/>
+                      </wps:cNvSpPr>
+                      <wps:spPr bwMode="auto">
+                        <a:xfrm>
+                          <a:off x="0" y="0"/>
+                          <a:ext cx="2360930" cy="1404620"/>
+                        </a:xfrm>
+                        <a:prstGeom prst="rect">
+                          <a:avLst/>
+                        </a:prstGeom>
+                        <a:noFill/>
+                        <a:ln w="9525">
+                          <a:solidFill>
+                            <a:srgbClr val="000000"/>
+                          </a:solidFill>
+                          <a:miter lim="800000"/>
+                          <a:headEnd/>
+                          <a:tailEnd/>
+                        </a:ln>
+                      </wps:spPr>
+                      <wps:txbx>
+                        <w:txbxContent>
+                          <w:p>
+                            <w:pPr>
+                              <w:jc w:val="center"/>
+                              <w:rPr>
+                                <w:b/>
+                                <w:bCs/>
+                                <w:sz w:val="56"/>
+                                <w:szCs w:val="56"/>
+                                <w:lang w:bidi="ar-EG"/>
+                              </w:rPr>
+                            </w:pPr>
+                            <w:r>
+                              <w:rPr>
+                                <w:b/>
+                                <w:bCs/>
+                                <w:sz w:val="56"/>
+                                <w:szCs w:val="56"/>
+                                <w:lang w:bidi="ar-EG"/>
+                              </w:rPr>
+                              <w:t>Phone</w:t>
+                            </w:r>
+                          </w:p>
+                        </w:txbxContent>
+                      </wps:txbx>
+                      <wps:bodyPr rot="0" vert="horz" wrap="square" lIns="91440" tIns="45720" rIns="91440" bIns="45720" anchor="t" anchorCtr="0">
+                        <a:spAutoFit/>
+                      </wps:bodyPr>
+                    </wps:wsp>
+                  </a:graphicData>
+                </a:graphic>
+                <wp14:sizeRelH relativeFrom="margin">
+                  <wp14:pctWidth>40000</wp14:pctWidth>
+                </wp14:sizeRelH>
+                <wp14:sizeRelV relativeFrom="margin">
+                  <wp14:pctHeight>20000</wp14:pctHeight>
+                </wp14:sizeRelV>
+              </wp:anchor>
+            </w:drawing>
+          </mc:Choice>
+          <mc:Fallback>
+            <w:pict>
+              <v:shape w14:anchorId="5FECBAC5" id="_x0000_s1027" type="#_x0000_t202" style="position:absolute;margin-left:16.2pt;margin-top:363.1pt;width:185.9pt;height:110.6pt;z-index:251657216;visibility:visible;mso-wrap-style:square;mso-width-percent:400;mso-height-percent:200;mso-wrap-distance-left:9pt;mso-wrap-distance-top:3.6pt;mso-wrap-distance-right:9pt;mso-wrap-distance-bottom:3.6pt;mso-position-horizontal:absolute;mso-position-horizontal-relative:text;mso-position-vertical:absolute;mso-position-vertical-relative:text;mso-width-percent:400;mso-height-percent:200;mso-width-relative:margin;mso-height-relative:margin;v-text-anchor:top" o:gfxdata="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" filled="f">
+                <v:textbox style="mso-fit-shape-to-text:t">
+                  <w:txbxContent>
+                    <w:p>
+                      <w:pPr>
+                        <w:jc w:val="center"/>
+                        <w:rPr>
+                          <w:b/>
+                          <w:bCs/>
+                          <w:sz w:val="56"/>
+                          <w:szCs w:val="56"/>
+                          <w:lang w:bidi="ar-EG"/>
+                        </w:rPr>
+                      </w:pPr>
+                      <w:r>
+                        <w:rPr>
+                          <w:b/>
+                          <w:bCs/>
+                          <w:sz w:val="56"/>
+                          <w:szCs w:val="56"/>
+                          <w:lang w:bidi="ar-EG"/>
+                        </w:rPr>
+                        <w:t>Phone</w:t>
+                      </w:r>
+                    </w:p>
+                  </w:txbxContent>
+                </v:textbox>
+                <w10:wrap type="square"/>
+              </v:shape>
+            </w:pict>
+          </mc:Fallback>
+        </mc:AlternateContent>
+      </w:r>
+      <w:r>
+        <w:rPr>
+          <w:rFonts w:ascii="Lucida Bright" w:hAnsi="Lucida Bright"/>
+          <w:noProof/>
+          <w:sz w:val="36"/>
+          <w:szCs w:val="36"/>
+        </w:rPr>
+        <mc:AlternateContent>
+          <mc:Choice Requires="wps">
+            <w:drawing>
+              <wp:anchor distT="45720" distB="45720" distL="114300" distR="114300" simplePos="0" relativeHeight="251648000" behindDoc="0" locked="0" layoutInCell="1" allowOverlap="1" wp14:anchorId="20D99B0E" wp14:editId="05B8C6C5">
                 <wp:simplePos x="0" y="0"/>
                 <wp:positionH relativeFrom="column">
                   <wp:posOffset>2004695</wp:posOffset>
@@ -574,11 +828,7 @@
           </mc:Choice>
           <mc:Fallback>
             <w:pict>
-              <v:shapetype w14:anchorId="20D99B0E" id="_x0000_t202" coordsize="21600,21600" o:spt="202" path="m,l,21600r21600,l21600,xe">
-                <v:stroke joinstyle="miter"/>
-                <v:path gradientshapeok="t" o:connecttype="rect"/>
-              </v:shapetype>
-              <v:shape id="Text Box 2" o:spid="_x0000_s1026" type="#_x0000_t202" style="position:absolute;margin-left:157.85pt;margin-top:415.7pt;width:185.9pt;height:110.6pt;z-index:251649024;visibility:visible;mso-wrap-style:square;mso-width-percent:400;mso-height-percent:200;mso-wrap-distance-left:9pt;mso-wrap-distance-top:3.6pt;mso-wrap-distance-right:9pt;mso-wrap-distance-bottom:3.6pt;mso-position-horizontal:absolute;mso-position-horizontal-relative:text;mso-position-vertical:absolute;mso-position-vertical-relative:text;mso-width-percent:400;mso-height-percent:200;mso-width-relative:margin;mso-height-relative:margin;v-text-anchor:top" o:gfxdata="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">
+              <v:shape w14:anchorId="20D99B0E" id="_x0000_s1028" type="#_x0000_t202" style="position:absolute;margin-left:157.85pt;margin-top:415.7pt;width:185.9pt;height:110.6pt;z-index:251648000;visibility:visible;mso-wrap-style:square;mso-width-percent:400;mso-height-percent:200;mso-wrap-distance-left:9pt;mso-wrap-distance-top:3.6pt;mso-wrap-distance-right:9pt;mso-wrap-distance-bottom:3.6pt;mso-position-horizontal:absolute;mso-position-horizontal-relative:text;mso-position-vertical:absolute;mso-position-vertical-relative:text;mso-width-percent:400;mso-height-percent:200;mso-width-relative:margin;mso-height-relative:margin;v-text-anchor:top" o:gfxdata="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">
                 <v:textbox style="mso-fit-shape-to-text:t">
                   <w:txbxContent>
                     <w:p>
@@ -628,7 +878,7 @@
         <mc:AlternateContent>
           <mc:Choice Requires="wps">
             <w:drawing>
-              <wp:anchor distT="45720" distB="45720" distL="114300" distR="114300" simplePos="0" relativeHeight="251666432" behindDoc="0" locked="0" layoutInCell="1" allowOverlap="1" wp14:anchorId="66391D12" wp14:editId="11AA81CB">
+              <wp:anchor distT="45720" distB="45720" distL="114300" distR="114300" simplePos="0" relativeHeight="251669504" behindDoc="0" locked="0" layoutInCell="1" allowOverlap="1" wp14:anchorId="66391D12" wp14:editId="11AA81CB">
                 <wp:simplePos x="0" y="0"/>
                 <wp:positionH relativeFrom="column">
                   <wp:posOffset>3977640</wp:posOffset>
@@ -710,7 +960,7 @@
           </mc:Choice>
           <mc:Fallback>
             <w:pict>
-              <v:shape w14:anchorId="66391D12" id="_x0000_s1027" type="#_x0000_t202" style="position:absolute;margin-left:313.2pt;margin-top:363.35pt;width:185.9pt;height:110.6pt;z-index:251666432;visibility:visible;mso-wrap-style:square;mso-width-percent:400;mso-height-percent:200;mso-wrap-distance-left:9pt;mso-wrap-distance-top:3.6pt;mso-wrap-distance-right:9pt;mso-wrap-distance-bottom:3.6pt;mso-position-horizontal:absolute;mso-position-horizontal-relative:text;mso-position-vertical:absolute;mso-position-vertical-relative:text;mso-width-percent:400;mso-height-percent:200;mso-width-relative:margin;mso-height-relative:margin;v-text-anchor:top" o:gfxdata="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" filled="f">
+              <v:shape w14:anchorId="66391D12" id="_x0000_s1029" type="#_x0000_t202" style="position:absolute;margin-left:313.2pt;margin-top:363.35pt;width:185.9pt;height:110.6pt;z-index:251669504;visibility:visible;mso-wrap-style:square;mso-width-percent:400;mso-height-percent:200;mso-wrap-distance-left:9pt;mso-wrap-distance-top:3.6pt;mso-wrap-distance-right:9pt;mso-wrap-distance-bottom:3.6pt;mso-position-horizontal:absolute;mso-position-horizontal-relative:text;mso-position-vertical:absolute;mso-position-vertical-relative:text;mso-width-percent:400;mso-height-percent:200;mso-width-relative:margin;mso-height-relative:margin;v-text-anchor:top" o:gfxdata="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" filled="f">
                 <v:textbox style="mso-fit-shape-to-text:t">
                   <w:txbxContent>
                     <w:p>
@@ -751,7 +1001,7 @@
           <w:szCs w:val="36"/>
         </w:rPr>
         <w:drawing>
-          <wp:anchor distT="0" distB="0" distL="114300" distR="114300" simplePos="0" relativeHeight="251654144" behindDoc="0" locked="0" layoutInCell="1" allowOverlap="1" wp14:anchorId="58954433" wp14:editId="0B11C839">
+          <wp:anchor distT="0" distB="0" distL="114300" distR="114300" simplePos="0" relativeHeight="251653120" behindDoc="0" locked="0" layoutInCell="1" allowOverlap="1" wp14:anchorId="58954433" wp14:editId="40956B56">
             <wp:simplePos x="0" y="0"/>
             <wp:positionH relativeFrom="column">
               <wp:posOffset>711200</wp:posOffset>
@@ -823,132 +1073,7 @@
         <mc:AlternateContent>
           <mc:Choice Requires="wps">
             <w:drawing>
-              <wp:anchor distT="45720" distB="45720" distL="114300" distR="114300" simplePos="0" relativeHeight="251665408" behindDoc="0" locked="0" layoutInCell="1" allowOverlap="1" wp14:anchorId="41B255B2" wp14:editId="7C903555">
-                <wp:simplePos x="0" y="0"/>
-                <wp:positionH relativeFrom="column">
-                  <wp:posOffset>60960</wp:posOffset>
-                </wp:positionH>
-                <wp:positionV relativeFrom="paragraph">
-                  <wp:posOffset>4615815</wp:posOffset>
-                </wp:positionV>
-                <wp:extent cx="2360930" cy="1404620"/>
-                <wp:effectExtent l="0" t="0" r="19050" b="17780"/>
-                <wp:wrapSquare wrapText="bothSides"/>
-                <wp:docPr id="511940757" name="Text Box 2"/>
-                <wp:cNvGraphicFramePr>
-                  <a:graphicFrameLocks xmlns:a="http://schemas.openxmlformats.org/drawingml/2006/main"/>
-                </wp:cNvGraphicFramePr>
-                <a:graphic xmlns:a="http://schemas.openxmlformats.org/drawingml/2006/main">
-                  <a:graphicData uri="http://schemas.microsoft.com/office/word/2010/wordprocessingShape">
-                    <wps:wsp>
-                      <wps:cNvSpPr txBox="1">
-                        <a:spLocks noChangeArrowheads="1"/>
-                      </wps:cNvSpPr>
-                      <wps:spPr bwMode="auto">
-                        <a:xfrm>
-                          <a:off x="0" y="0"/>
-                          <a:ext cx="2360930" cy="1404620"/>
-                        </a:xfrm>
-                        <a:prstGeom prst="rect">
-                          <a:avLst/>
-                        </a:prstGeom>
-                        <a:noFill/>
-                        <a:ln w="9525">
-                          <a:solidFill>
-                            <a:srgbClr val="000000"/>
-                          </a:solidFill>
-                          <a:miter lim="800000"/>
-                          <a:headEnd/>
-                          <a:tailEnd/>
-                        </a:ln>
-                      </wps:spPr>
-                      <wps:txbx>
-                        <w:txbxContent>
-                          <w:p>
-                            <w:pPr>
-                              <w:jc w:val="center"/>
-                              <w:rPr>
-                                <w:b/>
-                                <w:bCs/>
-                                <w:sz w:val="56"/>
-                                <w:szCs w:val="56"/>
-                                <w:lang w:bidi="ar-EG"/>
-                              </w:rPr>
-                            </w:pPr>
-                            <w:r>
-                              <w:rPr>
-                                <w:b/>
-                                <w:bCs/>
-                                <w:sz w:val="56"/>
-                                <w:szCs w:val="56"/>
-                                <w:lang w:bidi="ar-EG"/>
-                              </w:rPr>
-                              <w:t>Tablet</w:t>
-                            </w:r>
-                          </w:p>
-                        </w:txbxContent>
-                      </wps:txbx>
-                      <wps:bodyPr rot="0" vert="horz" wrap="square" lIns="91440" tIns="45720" rIns="91440" bIns="45720" anchor="t" anchorCtr="0">
-                        <a:spAutoFit/>
-                      </wps:bodyPr>
-                    </wps:wsp>
-                  </a:graphicData>
-                </a:graphic>
-                <wp14:sizeRelH relativeFrom="margin">
-                  <wp14:pctWidth>40000</wp14:pctWidth>
-                </wp14:sizeRelH>
-                <wp14:sizeRelV relativeFrom="margin">
-                  <wp14:pctHeight>20000</wp14:pctHeight>
-                </wp14:sizeRelV>
-              </wp:anchor>
-            </w:drawing>
-          </mc:Choice>
-          <mc:Fallback>
-            <w:pict>
-              <v:shape w14:anchorId="41B255B2" id="_x0000_s1028" type="#_x0000_t202" style="position:absolute;margin-left:4.8pt;margin-top:363.45pt;width:185.9pt;height:110.6pt;z-index:251665408;visibility:visible;mso-wrap-style:square;mso-width-percent:400;mso-height-percent:200;mso-wrap-distance-left:9pt;mso-wrap-distance-top:3.6pt;mso-wrap-distance-right:9pt;mso-wrap-distance-bottom:3.6pt;mso-position-horizontal:absolute;mso-position-horizontal-relative:text;mso-position-vertical:absolute;mso-position-vertical-relative:text;mso-width-percent:400;mso-height-percent:200;mso-width-relative:margin;mso-height-relative:margin;v-text-anchor:top" o:gfxdata="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" filled="f">
-                <v:textbox style="mso-fit-shape-to-text:t">
-                  <w:txbxContent>
-                    <w:p>
-                      <w:pPr>
-                        <w:jc w:val="center"/>
-                        <w:rPr>
-                          <w:b/>
-                          <w:bCs/>
-                          <w:sz w:val="56"/>
-                          <w:szCs w:val="56"/>
-                          <w:lang w:bidi="ar-EG"/>
-                        </w:rPr>
-                      </w:pPr>
-                      <w:r>
-                        <w:rPr>
-                          <w:b/>
-                          <w:bCs/>
-                          <w:sz w:val="56"/>
-                          <w:szCs w:val="56"/>
-                          <w:lang w:bidi="ar-EG"/>
-                        </w:rPr>
-                        <w:t>Tablet</w:t>
-                      </w:r>
-                    </w:p>
-                  </w:txbxContent>
-                </v:textbox>
-                <w10:wrap type="square"/>
-              </v:shape>
-            </w:pict>
-          </mc:Fallback>
-        </mc:AlternateContent>
-      </w:r>
-      <w:r>
-        <w:rPr>
-          <w:rFonts w:ascii="Lucida Bright" w:hAnsi="Lucida Bright"/>
-          <w:noProof/>
-          <w:sz w:val="36"/>
-          <w:szCs w:val="36"/>
-        </w:rPr>
-        <mc:AlternateContent>
-          <mc:Choice Requires="wps">
-            <w:drawing>
-              <wp:anchor distT="45720" distB="45720" distL="114300" distR="114300" simplePos="0" relativeHeight="251664384" behindDoc="0" locked="0" layoutInCell="1" allowOverlap="1" wp14:anchorId="0983485E" wp14:editId="302452FB">
+              <wp:anchor distT="45720" distB="45720" distL="114300" distR="114300" simplePos="0" relativeHeight="251659264" behindDoc="0" locked="0" layoutInCell="1" allowOverlap="1" wp14:anchorId="0983485E" wp14:editId="56359549">
                 <wp:simplePos x="0" y="0"/>
                 <wp:positionH relativeFrom="column">
                   <wp:posOffset>3977640</wp:posOffset>
@@ -1030,7 +1155,7 @@
           </mc:Choice>
           <mc:Fallback>
             <w:pict>
-              <v:shape w14:anchorId="0983485E" id="_x0000_s1029" type="#_x0000_t202" style="position:absolute;margin-left:313.2pt;margin-top:196.05pt;width:185.9pt;height:110.6pt;z-index:251664384;visibility:visible;mso-wrap-style:square;mso-width-percent:400;mso-height-percent:200;mso-wrap-distance-left:9pt;mso-wrap-distance-top:3.6pt;mso-wrap-distance-right:9pt;mso-wrap-distance-bottom:3.6pt;mso-position-horizontal:absolute;mso-position-horizontal-relative:text;mso-position-vertical:absolute;mso-position-vertical-relative:text;mso-width-percent:400;mso-height-percent:200;mso-width-relative:margin;mso-height-relative:margin;v-text-anchor:top" o:gfxdata="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" filled="f">
+              <v:shape w14:anchorId="0983485E" id="_x0000_s1030" type="#_x0000_t202" style="position:absolute;margin-left:313.2pt;margin-top:196.05pt;width:185.9pt;height:110.6pt;z-index:251659264;visibility:visible;mso-wrap-style:square;mso-width-percent:400;mso-height-percent:200;mso-wrap-distance-left:9pt;mso-wrap-distance-top:3.6pt;mso-wrap-distance-right:9pt;mso-wrap-distance-bottom:3.6pt;mso-position-horizontal:absolute;mso-position-horizontal-relative:text;mso-position-vertical:absolute;mso-position-vertical-relative:text;mso-width-percent:400;mso-height-percent:200;mso-width-relative:margin;mso-height-relative:margin;v-text-anchor:top" o:gfxdata="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" filled="f">
                 <v:textbox style="mso-fit-shape-to-text:t">
                   <w:txbxContent>
                     <w:p>
@@ -1053,131 +1178,6 @@
                           <w:lang w:bidi="ar-EG"/>
                         </w:rPr>
                         <w:t>Computer</w:t>
-                      </w:r>
-                    </w:p>
-                  </w:txbxContent>
-                </v:textbox>
-                <w10:wrap type="square"/>
-              </v:shape>
-            </w:pict>
-          </mc:Fallback>
-        </mc:AlternateContent>
-      </w:r>
-      <w:r>
-        <w:rPr>
-          <w:rFonts w:ascii="Lucida Bright" w:hAnsi="Lucida Bright"/>
-          <w:noProof/>
-          <w:sz w:val="36"/>
-          <w:szCs w:val="36"/>
-        </w:rPr>
-        <mc:AlternateContent>
-          <mc:Choice Requires="wps">
-            <w:drawing>
-              <wp:anchor distT="45720" distB="45720" distL="114300" distR="114300" simplePos="0" relativeHeight="251662336" behindDoc="0" locked="0" layoutInCell="1" allowOverlap="1" wp14:anchorId="5FECBAC5" wp14:editId="7FD1D6A4">
-                <wp:simplePos x="0" y="0"/>
-                <wp:positionH relativeFrom="column">
-                  <wp:posOffset>243840</wp:posOffset>
-                </wp:positionH>
-                <wp:positionV relativeFrom="paragraph">
-                  <wp:posOffset>2493010</wp:posOffset>
-                </wp:positionV>
-                <wp:extent cx="2360930" cy="1404620"/>
-                <wp:effectExtent l="0" t="0" r="19050" b="17780"/>
-                <wp:wrapSquare wrapText="bothSides"/>
-                <wp:docPr id="2131063583" name="Text Box 2"/>
-                <wp:cNvGraphicFramePr>
-                  <a:graphicFrameLocks xmlns:a="http://schemas.openxmlformats.org/drawingml/2006/main"/>
-                </wp:cNvGraphicFramePr>
-                <a:graphic xmlns:a="http://schemas.openxmlformats.org/drawingml/2006/main">
-                  <a:graphicData uri="http://schemas.microsoft.com/office/word/2010/wordprocessingShape">
-                    <wps:wsp>
-                      <wps:cNvSpPr txBox="1">
-                        <a:spLocks noChangeArrowheads="1"/>
-                      </wps:cNvSpPr>
-                      <wps:spPr bwMode="auto">
-                        <a:xfrm>
-                          <a:off x="0" y="0"/>
-                          <a:ext cx="2360930" cy="1404620"/>
-                        </a:xfrm>
-                        <a:prstGeom prst="rect">
-                          <a:avLst/>
-                        </a:prstGeom>
-                        <a:noFill/>
-                        <a:ln w="9525">
-                          <a:solidFill>
-                            <a:srgbClr val="000000"/>
-                          </a:solidFill>
-                          <a:miter lim="800000"/>
-                          <a:headEnd/>
-                          <a:tailEnd/>
-                        </a:ln>
-                      </wps:spPr>
-                      <wps:txbx>
-                        <w:txbxContent>
-                          <w:p>
-                            <w:pPr>
-                              <w:jc w:val="center"/>
-                              <w:rPr>
-                                <w:b/>
-                                <w:bCs/>
-                                <w:sz w:val="56"/>
-                                <w:szCs w:val="56"/>
-                                <w:lang w:bidi="ar-EG"/>
-                              </w:rPr>
-                            </w:pPr>
-                            <w:r>
-                              <w:rPr>
-                                <w:b/>
-                                <w:bCs/>
-                                <w:sz w:val="56"/>
-                                <w:szCs w:val="56"/>
-                                <w:lang w:bidi="ar-EG"/>
-                              </w:rPr>
-                              <w:t>Phone</w:t>
-                            </w:r>
-                          </w:p>
-                        </w:txbxContent>
-                      </wps:txbx>
-                      <wps:bodyPr rot="0" vert="horz" wrap="square" lIns="91440" tIns="45720" rIns="91440" bIns="45720" anchor="t" anchorCtr="0">
-                        <a:spAutoFit/>
-                      </wps:bodyPr>
-                    </wps:wsp>
-                  </a:graphicData>
-                </a:graphic>
-                <wp14:sizeRelH relativeFrom="margin">
-                  <wp14:pctWidth>40000</wp14:pctWidth>
-                </wp14:sizeRelH>
-                <wp14:sizeRelV relativeFrom="margin">
-                  <wp14:pctHeight>20000</wp14:pctHeight>
-                </wp14:sizeRelV>
-              </wp:anchor>
-            </w:drawing>
-          </mc:Choice>
-          <mc:Fallback>
-            <w:pict>
-              <v:shape w14:anchorId="5FECBAC5" id="_x0000_s1030" type="#_x0000_t202" style="position:absolute;margin-left:19.2pt;margin-top:196.3pt;width:185.9pt;height:110.6pt;z-index:251662336;visibility:visible;mso-wrap-style:square;mso-width-percent:400;mso-height-percent:200;mso-wrap-distance-left:9pt;mso-wrap-distance-top:3.6pt;mso-wrap-distance-right:9pt;mso-wrap-distance-bottom:3.6pt;mso-position-horizontal:absolute;mso-position-horizontal-relative:text;mso-position-vertical:absolute;mso-position-vertical-relative:text;mso-width-percent:400;mso-height-percent:200;mso-width-relative:margin;mso-height-relative:margin;v-text-anchor:top" o:gfxdata="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" filled="f">
-                <v:textbox style="mso-fit-shape-to-text:t">
-                  <w:txbxContent>
-                    <w:p>
-                      <w:pPr>
-                        <w:jc w:val="center"/>
-                        <w:rPr>
-                          <w:b/>
-                          <w:bCs/>
-                          <w:sz w:val="56"/>
-                          <w:szCs w:val="56"/>
-                          <w:lang w:bidi="ar-EG"/>
-                        </w:rPr>
-                      </w:pPr>
-                      <w:r>
-                        <w:rPr>
-                          <w:b/>
-                          <w:bCs/>
-                          <w:sz w:val="56"/>
-                          <w:szCs w:val="56"/>
-                          <w:lang w:bidi="ar-EG"/>
-                        </w:rPr>
-                        <w:t>Phone</w:t>
                       </w:r>
                     </w:p>
                   </w:txbxContent>
@@ -2075,7 +2075,7 @@
           </mc:Choice>
           <mc:Fallback>
             <w:pict>
-              <v:line w14:anchorId="41A04749" id="Straight Connector 9" o:spid="_x0000_s1026" style="position:absolute;left:0;text-align:left;z-index:251659264;visibility:visible;mso-wrap-style:square;mso-wrap-distance-left:9pt;mso-wrap-distance-top:0;mso-wrap-distance-right:9pt;mso-wrap-distance-bottom:0;mso-position-horizontal:absolute;mso-position-horizontal-relative:text;mso-position-vertical:absolute;mso-position-vertical-relative:text" from="42.2pt,235.85pt" to="175.05pt,235.85pt" o:gfxdata="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" strokecolor="black [3200]" strokeweight="3pt">
+              <v:line w14:anchorId="507E6499" id="Straight Connector 9" o:spid="_x0000_s1026" style="position:absolute;left:0;text-align:left;z-index:251659264;visibility:visible;mso-wrap-style:square;mso-wrap-distance-left:9pt;mso-wrap-distance-top:0;mso-wrap-distance-right:9pt;mso-wrap-distance-bottom:0;mso-position-horizontal:absolute;mso-position-horizontal-relative:text;mso-position-vertical:absolute;mso-position-vertical-relative:text" from="42.2pt,235.85pt" to="175.05pt,235.85pt" o:gfxdata="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" strokecolor="black [3200]" strokeweight="3pt">
                 <v:shadow on="t" color="black" opacity="22937f" origin=",.5" offset="0,.63889mm"/>
               </v:line>
             </w:pict>
@@ -2141,7 +2141,7 @@
           </mc:Choice>
           <mc:Fallback>
             <w:pict>
-              <v:line w14:anchorId="29FBAA61" id="Straight Connector 9" o:spid="_x0000_s1026" style="position:absolute;left:0;text-align:left;z-index:251663360;visibility:visible;mso-wrap-style:square;mso-wrap-distance-left:9pt;mso-wrap-distance-top:0;mso-wrap-distance-right:9pt;mso-wrap-distance-bottom:0;mso-position-horizontal:absolute;mso-position-horizontal-relative:text;mso-position-vertical:absolute;mso-position-vertical-relative:text" from="362.55pt,235.95pt" to="495.4pt,235.95pt" o:gfxdata="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" strokecolor="black [3200]" strokeweight="3pt">
+              <v:line w14:anchorId="3CD884D0" id="Straight Connector 9" o:spid="_x0000_s1026" style="position:absolute;left:0;text-align:left;z-index:251663360;visibility:visible;mso-wrap-style:square;mso-wrap-distance-left:9pt;mso-wrap-distance-top:0;mso-wrap-distance-right:9pt;mso-wrap-distance-bottom:0;mso-position-horizontal:absolute;mso-position-horizontal-relative:text;mso-position-vertical:absolute;mso-position-vertical-relative:text" from="362.55pt,235.95pt" to="495.4pt,235.95pt" o:gfxdata="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" strokecolor="black [3200]" strokeweight="3pt">
                 <v:shadow on="t" color="black" opacity="22937f" origin=",.5" offset="0,.63889mm"/>
               </v:line>
             </w:pict>
@@ -2207,7 +2207,7 @@
           </mc:Choice>
           <mc:Fallback>
             <w:pict>
-              <v:line w14:anchorId="5E927860" id="Straight Connector 9" o:spid="_x0000_s1026" style="position:absolute;left:0;text-align:left;z-index:251661312;visibility:visible;mso-wrap-style:square;mso-wrap-distance-left:9pt;mso-wrap-distance-top:0;mso-wrap-distance-right:9pt;mso-wrap-distance-bottom:0;mso-position-horizontal:absolute;mso-position-horizontal-relative:text;mso-position-vertical:absolute;mso-position-vertical-relative:text" from="362.8pt,403.5pt" to="495.65pt,403.5pt" o:gfxdata="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" strokecolor="black [3200]" strokeweight="3pt">
+              <v:line w14:anchorId="3F4AFDA1" id="Straight Connector 9" o:spid="_x0000_s1026" style="position:absolute;left:0;text-align:left;z-index:251661312;visibility:visible;mso-wrap-style:square;mso-wrap-distance-left:9pt;mso-wrap-distance-top:0;mso-wrap-distance-right:9pt;mso-wrap-distance-bottom:0;mso-position-horizontal:absolute;mso-position-horizontal-relative:text;mso-position-vertical:absolute;mso-position-vertical-relative:text" from="362.8pt,403.5pt" to="495.65pt,403.5pt" o:gfxdata="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" strokecolor="black [3200]" strokeweight="3pt">
                 <v:shadow on="t" color="black" opacity="22937f" origin=",.5" offset="0,.63889mm"/>
               </v:line>
             </w:pict>
@@ -2273,7 +2273,7 @@
           </mc:Choice>
           <mc:Fallback>
             <w:pict>
-              <v:line w14:anchorId="6AFF736B" id="Straight Connector 9" o:spid="_x0000_s1026" style="position:absolute;left:0;text-align:left;z-index:251660288;visibility:visible;mso-wrap-style:square;mso-wrap-distance-left:9pt;mso-wrap-distance-top:0;mso-wrap-distance-right:9pt;mso-wrap-distance-bottom:0;mso-position-horizontal:absolute;mso-position-horizontal-relative:text;mso-position-vertical:absolute;mso-position-vertical-relative:text" from="47.35pt,403.5pt" to="180.2pt,403.5pt" o:gfxdata="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" strokecolor="black [3200]" strokeweight="3pt">
+              <v:line w14:anchorId="43438664" id="Straight Connector 9" o:spid="_x0000_s1026" style="position:absolute;left:0;text-align:left;z-index:251660288;visibility:visible;mso-wrap-style:square;mso-wrap-distance-left:9pt;mso-wrap-distance-top:0;mso-wrap-distance-right:9pt;mso-wrap-distance-bottom:0;mso-position-horizontal:absolute;mso-position-horizontal-relative:text;mso-position-vertical:absolute;mso-position-vertical-relative:text" from="47.35pt,403.5pt" to="180.2pt,403.5pt" o:gfxdata="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" strokecolor="black [3200]" strokeweight="3pt">
                 <v:shadow on="t" color="black" opacity="22937f" origin=",.5" offset="0,.63889mm"/>
               </v:line>
             </w:pict>

</xml_diff>